<commit_message>
Align VitaDesa with mobile-only competition scope
</commit_message>
<xml_diff>
--- a/PROPOSAL_VITADESA_BAB_I-II.docx
+++ b/PROPOSAL_VITADESA_BAB_I-II.docx
@@ -557,7 +557,7 @@
           <w:szCs w:val="24"/>
           <w:rtl w:val="0"/>
         </w:rPr>
-        <w:t>Puji syukur kami panjatkan kepada Tuhan Yang Maha Esa karena proposal VitaDesa (Smart Local Vitamin &amp; Fortified Herbal Station) dapat disusun untuk mengikuti THE ACE 2026: UI/UX Competition. Karya ini mengangkat subtema Local Economy &amp; UMKM Empowerment serta Civic Services &amp; Public Access melalui rancangan pengalaman yang mempertemukan warga, layanan kesehatan lokal, teknologi kiosk, dan produsen herbal setempat.</w:t>
+        <w:t>Puji syukur kami panjatkan kepada Tuhan Yang Maha Esa karena proposal VitaDesa (Smart Local Vitamin &amp; Fortified Herbal Station) dapat disusun untuk mengikuti THE ACE 2026: UI/UX Competition. Karya ini mengangkat subtema Local Economy &amp; UMKM Empowerment serta Civic Services &amp; Public Access melalui rancangan aplikasi mobile yang mempertemukan warga dengan layanan kesehatan lokal, stasiun vitamin, dan produsen herbal setempat.</w:t>
       </w:r>
     </w:p>
     <w:p>
@@ -1597,7 +1597,7 @@
           <w:szCs w:val="24"/>
           <w:rtl w:val="0"/>
         </w:rPr>
-        <w:t>Mikronutrien merupakan vitamin dan mineral yang dibutuhkan tubuh dalam jumlah kecil, tetapi berperan penting bagi pertumbuhan dan kesehatan. Kekurangannya dapat berhubungan dengan anemia, gangguan tumbuh kembang, dan penurunan daya tahan tubuh (World Health Organization [WHO], 2025). Di Indonesia, hasil Survei Status Gizi Indonesia 2024 menunjukkan prevalensi stunting nasional masih berada pada 19,8% (Kementerian Kesehatan Republik Indonesia, 2025). Kondisi tersebut menegaskan perlunya layanan promotif dan preventif yang mudah dijangkau, terutama pada tingkat desa dan komunitas padat perkotaan. Pada sisi lain, vitamin komersial kerap dipersepsikan mahal, sedangkan pelaku UMKM jamu dan herbal lokal belum selalu terhubung dengan sistem distribusi, pencatatan stok, dan informasi dosis yang konsisten. UMKM sendiri mempunyai posisi strategis karena menyumbang 61,1% PDB dan menyerap 97,1% tenaga kerja Indonesia (Bank Indonesia, n.d.). Berdasarkan peluang tersebut, VitaDesa dirancang sebagai ekosistem layanan yang menghubungkan warga, kiosk vitamin publik, petugas Posyandu/Puskesmas, serta UMKM lokal. Sistem tidak mendiagnosis defisiensi melalui sensor sederhana; sensor hanya mensimulasikan indikator dasar, sedangkan paket menggunakan konfigurasi baku tenaga kesehatan dan produk yang memenuhi persyaratan keamanan, manfaat, mutu, serta informasi yang tidak menyesatkan.</w:t>
+        <w:t>Mikronutrien merupakan vitamin dan mineral yang dibutuhkan tubuh dalam jumlah kecil, tetapi berperan penting bagi pertumbuhan dan kesehatan. Kekurangannya dapat berhubungan dengan anemia, gangguan tumbuh kembang, dan penurunan daya tahan tubuh (World Health Organization [WHO], 2025). Di Indonesia, hasil Survei Status Gizi Indonesia 2024 menunjukkan prevalensi stunting nasional masih berada pada 19,8% (Kementerian Kesehatan Republik Indonesia, 2025). Kondisi tersebut menegaskan perlunya layanan promotif dan preventif yang mudah dijangkau, terutama pada tingkat desa dan komunitas padat perkotaan. Pada sisi lain, vitamin komersial kerap dipersepsikan mahal, sedangkan pelaku UMKM jamu dan herbal lokal belum selalu terhubung dengan sistem distribusi dan promosi yang relevan. UMKM sendiri mempunyai posisi strategis karena menyumbang 61,1% PDB dan menyerap 97,1% tenaga kerja Indonesia (Bank Indonesia, n.d.). Berdasarkan peluang tersebut, VitaDesa dirancang sebagai aplikasi mobile warga yang menghubungkan kebiasaan sehat, akses ke stasiun vitamin publik, dukungan Posyandu/Puskesmas, dan produk UMKM lokal. Aplikasi tidak mendiagnosis defisiensi; paket layanan menggunakan konfigurasi baku tenaga kesehatan dan produk yang memenuhi persyaratan keamanan, manfaat, mutu, serta informasi yang tidak menyesatkan.</w:t>
       </w:r>
     </w:p>
     <w:p>
@@ -1645,7 +1645,7 @@
           <w:szCs w:val="24"/>
           <w:rtl w:val="0"/>
         </w:rPr>
-        <w:t>Permasalahan yang hendak dijawab adalah: bagaimana menyediakan akses layanan vitamin dan herbal terfortifikasi yang dekat, inklusif, dan mudah digunakan; bagaimana membantu warga membangun kebiasaan konsumsi yang konsisten tanpa menampilkan klaim diagnosis; bagaimana menghubungkan pengalaman pada kiosk fisik dengan pemantauan pada aplikasi seluler; bagaimana memberi petugas data agregat untuk memantau partisipasi dan stok tanpa membuka identitas individu; serta bagaimana menciptakan permintaan yang berkelanjutan bagi UMKM herbal lokal melalui rantai pasok dan mekanisme loyalitas yang transparan.</w:t>
+        <w:t>Permasalahan yang hendak dijawab adalah: bagaimana aplikasi mobile dapat menyediakan akses informasi layanan vitamin dan herbal terfortifikasi yang dekat, inklusif, dan mudah digunakan; bagaimana membantu warga membangun kebiasaan konsumsi yang konsisten tanpa menampilkan klaim diagnosis; bagaimana memandu warga menghubungkan profil dan jadwal dengan stasiun layanan melalui QR; serta bagaimana menciptakan permintaan berkelanjutan bagi UMKM herbal lokal melalui katalog, poin, dan voucher yang transparan.</w:t>
       </w:r>
     </w:p>
     <w:p>
@@ -1693,7 +1693,7 @@
           <w:szCs w:val="24"/>
           <w:rtl w:val="0"/>
         </w:rPr>
-        <w:t>Perancangan VitaDesa bertujuan menghasilkan pengalaman lintas perangkat yang membantu warga dewasa dan keluarga memantau jadwal serta progress kebiasaan sehat, mengakses paket yang telah dikonfigurasi petugas melalui kiosk publik, dan memperoleh edukasi yang jelas. Tujuan lainnya adalah menyediakan antarmuka operasional bagi Posyandu/Puskesmas untuk memantau layanan dan inventaris, sekaligus membuka kanal pemasaran serta pemesanan ulang yang terukur bagi UMKM jamu dan herbal lokal.</w:t>
+        <w:t>Perancangan VitaDesa bertujuan menghasilkan pengalaman aplikasi mobile yang membantu warga dewasa dan keluarga memantau jadwal serta progress kebiasaan sehat, menemukan stasiun layanan, menghubungkan profil melalui QR, dan memperoleh edukasi yang jelas. Aplikasi juga bertujuan membuka kanal promosi yang relevan bagi UMKM jamu dan herbal lokal melalui katalog serta voucher berbasis poin, tanpa menjadikan akses inti warga sebagai layanan berbayar.</w:t>
       </w:r>
     </w:p>
     <w:p>
@@ -1741,7 +1741,7 @@
           <w:szCs w:val="24"/>
           <w:rtl w:val="0"/>
         </w:rPr>
-        <w:t>Bagi warga, VitaDesa memberikan akses yang lebih dekat, pengingat, dan visualisasi progress yang mudah dipahami. Bagi keluarga, profil terhubung memudahkan pendampingan anggota yang memerlukan dukungan. Bagi petugas, data agregat dapat mendukung perencanaan layanan dan respons terhadap stok menipis. Bagi UMKM, katalog voucher, pelacakan permintaan, dan pemesanan ulang memperluas pasar lokal. Dalam jangka panjang, integrasi tersebut diharapkan membangun kebiasaan sehat, memperkuat layanan publik, dan menciptakan sirkulasi ekonomi desa yang lebih berkelanjutan, dengan tetap mengikuti prinsip keamanan, manfaat ilmiah, dan kepentingan terbaik pengguna (Kementerian Kesehatan Republik Indonesia, 2018).</w:t>
+        <w:t>Bagi warga, VitaDesa memberikan akses informasi yang lebih dekat, pengingat, dan visualisasi progress yang mudah dipahami. Bagi keluarga, profil terhubung memudahkan pendampingan anggota yang memerlukan dukungan. Bagi petugas, alur QR yang ringkas membantu warga datang dengan informasi layanan yang sesuai. Bagi UMKM, katalog dan voucher memperluas jangkauan pasar lokal. Dalam jangka panjang, aplikasi diharapkan membangun kebiasaan sehat, memperkuat akses layanan publik, dan menciptakan sirkulasi ekonomi desa yang lebih berkelanjutan, dengan tetap mengikuti prinsip keamanan, manfaat ilmiah, dan kepentingan terbaik pengguna (Kementerian Kesehatan Republik Indonesia, 2018).</w:t>
       </w:r>
     </w:p>
     <w:p>
@@ -1864,7 +1864,7 @@
           <w:szCs w:val="24"/>
           <w:rtl w:val="0"/>
         </w:rPr>
-        <w:t>VitaDesa adalah ekosistem layanan UI/UX yang terdiri atas Citizen Mobile App, Kiosk IoT, serta Admin &amp; UMKM Dashboard. Aplikasi warga menampilkan daily vitamin tracker, progress gizi, jadwal, QR handoff, voucher, riwayat, notifikasi, dan profil keluarga. Kiosk di Balai Desa atau Posyandu menangani verifikasi QR/kartu, persetujuan, skrining indikator dasar non-diagnostik, konfirmasi paket baku, dan simulasi dispensing. Dashboard web membantu petugas dan UMKM melihat statistik agregat, inventaris, batch, kedaluwarsa, peringatan stok, dan pesanan ulang. Data sensitif ditampilkan berdasarkan peran dan heatmap hanya menggunakan agregasi wilayah.</w:t>
+        <w:t>Sesuai Ketentuan Lomba THE ACE 2026, VitaDesa mengambil satu platform studi kasus, yaitu Citizen Mobile App. Aplikasi menampilkan onboarding, login/register, daily vitamin tracker, progress gizi, jadwal, pemindaian QR stasiun, panduan pengambilan, katalog dan detail herbal, klaim voucher, riwayat mingguan/bulanan, notifikasi, profil pengguna, serta profil keluarga. Stasiun vitamin di Balai Desa atau Posyandu diposisikan sebagai konteks layanan fisik yang dihubungkan dari aplikasi, bukan sebagai platform antarmuka tambahan dalam karya kompetisi.</w:t>
       </w:r>
     </w:p>
     <w:p>
@@ -1912,7 +1912,7 @@
           <w:szCs w:val="24"/>
           <w:rtl w:val="0"/>
         </w:rPr>
-        <w:t>Keunikan VitaDesa terletak pada pengalaman fisik-digital yang menyatu. Pertama, kiosk memakai tombol besar, kontras tinggi, transkrip visual, dan panduan suara agar ramah bagi pengguna dengan beragam kemampuan. Kedua, QR handoff memindahkan konteks dari aplikasi ke kiosk tanpa pengisian ulang. Ketiga, safety by design memisahkan skrining dasar dari diagnosis; status mikronutrien tidak disimpulkan dari pulse atau skin sensor karena WHO menggunakan indikator biokimia untuk penilaian status mikronutrien (WHO, n.d.). Keempat, gamifikasi poin menghubungkan konsistensi warga dengan voucher UMKM. Kelima, sensor volume, pelacakan batch, dan health heatmap agregat menyatukan layanan kesehatan publik dengan rantai pasok lokal.</w:t>
+        <w:t>Keunikan VitaDesa terletak pada pengalaman mobile yang menyatukan kebiasaan sehat, akses layanan publik, dan ekonomi lokal. Pertama, informasi disajikan melalui hierarki visual jelas, tombol sentuh besar, kontras tinggi, serta bahasa yang ringkas. Kedua, QR handoff menghubungkan profil dan jadwal warga dengan stasiun layanan tanpa pengisian ulang. Ketiga, safety by design memisahkan edukasi dan pencatatan kebiasaan dari diagnosis; status mikronutrien tidak disimpulkan oleh aplikasi karena WHO menggunakan indikator biokimia untuk penilaian status mikronutrien (WHO, n.d.). Keempat, gamifikasi poin menghubungkan konsistensi warga dengan voucher UMKM. Kelima, profil keluarga membantu pendamping mengelola jadwal anggota keluarga dari satu aplikasi.</w:t>
       </w:r>
     </w:p>
     <w:p>
@@ -1962,7 +1962,7 @@
           <w:szCs w:val="24"/>
           <w:rtl w:val="0"/>
         </w:rPr>
-        <w:t>Pengguna utama adalah warga dewasa dan keluarga di desa atau komunitas perkotaan padat, termasuk pengguna yang mendampingi anak dan lansia. Anak, ibu hamil, atau pengguna berisiko tidak menerima keputusan otomatis; profil mereka dikelola pendamping dan diarahkan pada pengawasan Posyandu/Puskesmas. Pengguna operasional mencakup kader, petugas Puskesmas, pengelola desa, serta pemilik UMKM herbal. Pembeli institusional utama adalah pemerintah desa, fasilitas kesehatan tingkat pertama, dan mitra program kesehatan masyarakat.</w:t>
+        <w:t>Pengguna utama aplikasi adalah warga dewasa dan keluarga di desa atau komunitas perkotaan padat, termasuk pendamping anak dan lansia. Anak, ibu hamil, atau pengguna berisiko tidak menerima keputusan otomatis; profil mereka dikelola pendamping dan diarahkan pada pengawasan Posyandu/Puskesmas. Pemangku kepentingan pendukung mencakup kader, petugas Puskesmas, pemerintah desa, dan pemilik UMKM herbal, sedangkan pembeli institusional utama adalah pemerintah desa, fasilitas kesehatan tingkat pertama, dan mitra program kesehatan masyarakat.</w:t>
       </w:r>
     </w:p>
     <w:p>
@@ -2009,7 +2009,7 @@
           <w:szCs w:val="24"/>
           <w:rtl w:val="0"/>
         </w:rPr>
-        <w:t>Model pendapatan berfokus pada B2G dan B2B agar akses inti warga tetap gratis. Pemerintah desa atau fasilitas kesehatan dapat membayar biaya implementasi, sewa perangkat, pemeliharaan kiosk, dan langganan dashboard. UMKM dapat mengikuti kemitraan katalog serta membayar komisi kecil hanya ketika voucher berhasil digunakan. Sumber tambahan dapat berasal dari program CSR, hibah kesehatan preventif, dan kerja sama distribusi. Pendapatan tidak berasal dari penjualan data kesehatan pribadi, dan pengadaan produk harus memprioritaskan izin edar, ketertelusuran batch, serta informasi objektif sesuai Peraturan BPOM Nomor 10 Tahun 2024.</w:t>
+        <w:t>Model pendapatan berfokus pada B2G dan B2B agar akses inti aplikasi bagi warga tetap gratis. Pemerintah desa atau fasilitas kesehatan dapat membayar biaya implementasi program, integrasi layanan, dan pemeliharaan stasiun. UMKM dapat mengikuti kemitraan katalog serta membayar komisi kecil hanya ketika voucher berhasil digunakan. Sumber tambahan dapat berasal dari program CSR, hibah kesehatan preventif, dan kerja sama distribusi. Pendapatan tidak berasal dari penjualan data kesehatan pribadi, dan produk yang ditampilkan harus memprioritaskan izin edar, ketertelusuran batch, serta informasi objektif sesuai Peraturan BPOM Nomor 10 Tahun 2024.</w:t>
       </w:r>
       <w:r>
         <w:rPr>
@@ -2062,7 +2062,7 @@
           <w:szCs w:val="24"/>
           <w:rtl w:val="0"/>
         </w:rPr>
-        <w:t>Pengembangan menggunakan kerangka Double Diamond yang dipadukan dengan Design Thinking. Tahap Discover meliputi studi literatur, observasi layanan Posyandu, dan wawancara warga, petugas, serta UMKM. Tahap Define merumuskan persona, journey map, masalah aksesibilitas, risiko kesehatan, dan kebutuhan rantai pasok. Tahap Develop menghasilkan ide, arsitektur informasi, user flow lintas perangkat, wireframe, design system, dan prototype high-fidelity. Tahap Deliver menguji kegunaan melalui task-based usability testing, evaluasi aksesibilitas, validasi bahasa, dan service blueprint bersama pemangku kepentingan. Temuan pengujian kemudian diolah secara iteratif sebelum konsep diuji dalam pilot terbatas dengan tata kelola klinis dan privasi yang sesuai.</w:t>
+        <w:t>Pengembangan menggunakan kerangka Double Diamond yang dipadukan dengan Design Thinking. Tahap Discover meliputi studi literatur, observasi layanan Posyandu, dan wawancara warga, petugas, serta UMKM. Tahap Define merumuskan persona, journey map, masalah aksesibilitas, risiko kesehatan, dan kebutuhan warga pada aplikasi mobile. Tahap Develop menghasilkan ide, arsitektur informasi, user flow mobile, wireframe portrait, design system, dan prototype high-fidelity. Tahap Deliver menguji kegunaan melalui task-based usability testing, evaluasi aksesibilitas, validasi bahasa, dan pengujian alur QR bersama pemangku kepentingan. Temuan pengujian kemudian diolah secara iteratif sebelum konsep diuji dalam pilot terbatas dengan tata kelola klinis dan privasi yang sesuai.</w:t>
       </w:r>
       <w:r>
         <w:rPr>

</xml_diff>